<commit_message>
Versão 20 bytes V1
Primeira versão do novo pacote do MoT de 20 bytes
</commit_message>
<xml_diff>
--- a/3_Figuras/EXP8 - Documentação 26 05 21.docx
+++ b/3_Figuras/EXP8 - Documentação 26 05 21.docx
@@ -4,64 +4,60 @@
   <w:body>
     <w:p>
       <w:pPr>
+        <w:pStyle w:val="Ttulo1"/>
+      </w:pPr>
+      <w:r>
+        <w:t>DOCUMENTAÇÃO EXP8</w:t>
+      </w:r>
+    </w:p>
+    <w:p>
+      <w:pPr>
         <w:rPr>
           <w:b/>
           <w:bCs/>
         </w:rPr>
       </w:pPr>
+    </w:p>
+    <w:p>
       <w:r>
         <w:rPr>
           <w:b/>
           <w:bCs/>
         </w:rPr>
-        <w:t>DOCUMENTAÇÃO EXP8</w:t>
-      </w:r>
-    </w:p>
-    <w:p>
-      <w:pPr>
+        <w:t>Introdução</w:t>
+      </w:r>
+    </w:p>
+    <w:p>
+      <w:r>
+        <w:t>O EXP8 é o exemplo mais simples de MAC centralizada e os códigos estão todos uniformizados.</w:t>
+      </w:r>
+    </w:p>
+    <w:p/>
+    <w:p>
+      <w:r>
         <w:rPr>
           <w:b/>
           <w:bCs/>
         </w:rPr>
-      </w:pPr>
-    </w:p>
-    <w:p>
-      <w:r>
-        <w:rPr>
-          <w:b/>
-          <w:bCs/>
-        </w:rPr>
-        <w:t>Introdução</w:t>
-      </w:r>
-    </w:p>
-    <w:p>
-      <w:r>
-        <w:t>O EXP8 é o exemplo mais simples de MAC centralizada e os códigos estão todos uniformizados.</w:t>
+        <w:t>Revisão de Conceitos</w:t>
+      </w:r>
+    </w:p>
+    <w:p>
+      <w:r>
+        <w:t>A MAC centralizada cria uma política de acesso ao meio em que o Nível 3 - Borda envia um pacote de DL para o nó sensor, que responde com um pacote de UL</w:t>
       </w:r>
     </w:p>
     <w:p/>
     <w:p>
       <w:r>
-        <w:rPr>
-          <w:b/>
-          <w:bCs/>
-        </w:rPr>
-        <w:t>Revisão de Conceitos</w:t>
-      </w:r>
-    </w:p>
-    <w:p>
-      <w:r>
-        <w:t>A MAC centralizada cria uma política de acesso ao meio em que o Nível 3 - Borda envia um pacote de DL para o nó sensor, que responde com um pacote de UL</w:t>
-      </w:r>
-    </w:p>
-    <w:p/>
-    <w:p>
-      <w:r>
         <w:t>A próxima figura mostra uma topologia estrela.</w:t>
       </w:r>
     </w:p>
     <w:p>
       <w:r>
+        <w:rPr>
+          <w:noProof/>
+        </w:rPr>
         <w:drawing>
           <wp:inline distT="0" distB="0" distL="0" distR="0" wp14:anchorId="3115577D" wp14:editId="1ACA1295">
             <wp:extent cx="1044030" cy="1181202"/>
@@ -158,6 +154,7 @@
         <w:rPr>
           <w:b/>
           <w:bCs/>
+          <w:noProof/>
         </w:rPr>
         <w:lastRenderedPageBreak/>
         <w:drawing>
@@ -227,6 +224,9 @@
     <w:p/>
     <w:p>
       <w:r>
+        <w:rPr>
+          <w:noProof/>
+        </w:rPr>
         <w:drawing>
           <wp:inline distT="0" distB="0" distL="0" distR="0" wp14:anchorId="62C4E858" wp14:editId="3712721A">
             <wp:extent cx="2225233" cy="1767993"/>
@@ -337,6 +337,9 @@
     </w:p>
     <w:p>
       <w:r>
+        <w:rPr>
+          <w:noProof/>
+        </w:rPr>
         <w:lastRenderedPageBreak/>
         <w:drawing>
           <wp:inline distT="0" distB="0" distL="0" distR="0" wp14:anchorId="531BA8D1" wp14:editId="6728320A">
@@ -1215,6 +1218,7 @@
   <w:style w:type="character" w:default="1" w:styleId="Fontepargpadro">
     <w:name w:val="Default Paragraph Font"/>
     <w:uiPriority w:val="1"/>
+    <w:semiHidden/>
     <w:unhideWhenUsed/>
   </w:style>
   <w:style w:type="table" w:default="1" w:styleId="Tabelanormal">

</xml_diff>